<commit_message>
chore: update public URL and regenerate v3.10 DOCX and ZIP
</commit_message>
<xml_diff>
--- a/UPLOAD_THIS_ESMO_OPEN_V3_10_HARDENED_UNDER20/ESMO_OPEN_COVER_LETTER_RATIONALE_V3_10.docx
+++ b/UPLOAD_THIS_ESMO_OPEN_V3_10_HARDENED_UNDER20/ESMO_OPEN_COVER_LETTER_RATIONALE_V3_10.docx
@@ -122,7 +122,19 @@
         <w:pStyle w:val="BodyText"/>
       </w:pPr>
       <w:r>
-        <w:t xml:space="preserve">Author details, conflict-of-interest disclosures, funding, ethics/exemption wording and repository DOI should be completed by the submitting authors before portal upload.</w:t>
+        <w:t xml:space="preserve">Public repository URL: https://github.com/xutaoguo55/ici-irae-phenotype-decomposition-esmo-open-v3-10</w:t>
+      </w:r>
+      <w:r>
+        <w:t xml:space="preserve"> </w:t>
+      </w:r>
+      <w:r>
+        <w:t xml:space="preserve">DOI is pending; repository URL is available now.</w:t>
+      </w:r>
+      <w:r>
+        <w:t xml:space="preserve"> </w:t>
+      </w:r>
+      <w:r>
+        <w:t xml:space="preserve">Author details, conflict-of-interest disclosures, funding, ethics/exemption wording and repository metadata details should be completed by the submitting authors before portal upload.</w:t>
       </w:r>
     </w:p>
     <w:bookmarkEnd w:id="9"/>

</xml_diff>

<commit_message>
v3.10: add author list, affiliations, equal-contribution and corresponding-author metadata
Author order: Junwei Huang†, Xiaolei Wei†, Haiqing Zheng†, Qi Wei, Yongqiang Wei, Ru Feng, Xutao Guo*
Affiliations: Nanfang Hospital, Southern Medical University
- Manuscript DOCX: title page with full author block
- Cover Letter DOCX: authors section after salutation
- Supplementary Index: unchanged
- ZIP rebuilt with updated DOCX files

† Equal contribution for first three authors
* Correspondence: guoxutao@smu.edu.cn

Co-Authored-By: Claude <noreply@anthropic.com>
</commit_message>
<xml_diff>
--- a/UPLOAD_THIS_ESMO_OPEN_V3_10_HARDENED_UNDER20/ESMO_OPEN_COVER_LETTER_RATIONALE_V3_10.docx
+++ b/UPLOAD_THIS_ESMO_OPEN_V3_10_HARDENED_UNDER20/ESMO_OPEN_COVER_LETTER_RATIONALE_V3_10.docx
@@ -20,6 +20,106 @@
       </w:r>
     </w:p>
     <w:p>
+      <w:r>
+        <w:rPr>
+          <w:rFonts w:ascii="Times New Roman" w:hAnsi="Times New Roman"/>
+          <w:sz w:val="20"/>
+        </w:rPr>
+        <w:t xml:space="preserve"/>
+      </w:r>
+    </w:p>
+    <w:p>
+      <w:r>
+        <w:rPr>
+          <w:rFonts w:ascii="Times New Roman" w:hAnsi="Times New Roman"/>
+          <w:sz w:val="22"/>
+          <w:b/>
+        </w:rPr>
+        <w:t xml:space="preserve">Authors:</w:t>
+      </w:r>
+    </w:p>
+    <w:p>
+      <w:r>
+        <w:rPr>
+          <w:rFonts w:ascii="Times New Roman" w:hAnsi="Times New Roman"/>
+          <w:sz w:val="22"/>
+        </w:rPr>
+        <w:t xml:space="preserve">Junwei Huang†¹, Xiaolei Wei†¹, Haiqing Zheng†², Qi Wei¹, Yongqiang Wei¹, Ru Feng¹, Xutao Guo*¹,³</w:t>
+      </w:r>
+    </w:p>
+    <w:p>
+      <w:r>
+        <w:rPr>
+          <w:rFonts w:ascii="Times New Roman" w:hAnsi="Times New Roman"/>
+          <w:sz w:val="12"/>
+        </w:rPr>
+        <w:t xml:space="preserve"/>
+      </w:r>
+    </w:p>
+    <w:p>
+      <w:r>
+        <w:rPr>
+          <w:rFonts w:ascii="Times New Roman" w:hAnsi="Times New Roman"/>
+          <w:sz w:val="20"/>
+        </w:rPr>
+        <w:t xml:space="preserve">¹ Department of Hematology, Nanfang Hospital, Southern Medical University, Guangzhou, China</w:t>
+      </w:r>
+    </w:p>
+    <w:p>
+      <w:r>
+        <w:rPr>
+          <w:rFonts w:ascii="Times New Roman" w:hAnsi="Times New Roman"/>
+          <w:sz w:val="20"/>
+        </w:rPr>
+        <w:t xml:space="preserve">² Department of Nosocomial Infection Management, Nanfang Hospital, Southern Medical University, Guangzhou, China</w:t>
+      </w:r>
+    </w:p>
+    <w:p>
+      <w:r>
+        <w:rPr>
+          <w:rFonts w:ascii="Times New Roman" w:hAnsi="Times New Roman"/>
+          <w:sz w:val="20"/>
+        </w:rPr>
+        <w:t xml:space="preserve">³ Clinical Medical Research Center of Hematological Diseases of Guangdong Province, Guangzhou, China</w:t>
+      </w:r>
+    </w:p>
+    <w:p>
+      <w:r>
+        <w:rPr>
+          <w:rFonts w:ascii="Times New Roman" w:hAnsi="Times New Roman"/>
+          <w:sz w:val="12"/>
+        </w:rPr>
+        <w:t xml:space="preserve"/>
+      </w:r>
+    </w:p>
+    <w:p>
+      <w:r>
+        <w:rPr>
+          <w:rFonts w:ascii="Times New Roman" w:hAnsi="Times New Roman"/>
+          <w:sz w:val="20"/>
+        </w:rPr>
+        <w:t xml:space="preserve">† These authors contributed equally to this work.</w:t>
+      </w:r>
+    </w:p>
+    <w:p>
+      <w:r>
+        <w:rPr>
+          <w:rFonts w:ascii="Times New Roman" w:hAnsi="Times New Roman"/>
+          <w:sz w:val="20"/>
+        </w:rPr>
+        <w:t xml:space="preserve">* Correspondence: Xutao Guo, guoxutao@smu.edu.cn</w:t>
+      </w:r>
+    </w:p>
+    <w:p>
+      <w:r>
+        <w:rPr>
+          <w:rFonts w:ascii="Times New Roman" w:hAnsi="Times New Roman"/>
+          <w:sz w:val="20"/>
+        </w:rPr>
+        <w:t xml:space="preserve"/>
+      </w:r>
+    </w:p>
+    <w:p>
       <w:pPr>
         <w:pStyle w:val="BodyText"/>
       </w:pPr>
@@ -122,23 +222,13 @@
         <w:pStyle w:val="BodyText"/>
       </w:pPr>
       <w:r>
-        <w:t xml:space="preserve">Public repository URL: https://github.com/xutaoguo55/ici-irae-phenotype-decomposition-esmo-open-v3-10</w:t>
-      </w:r>
-      <w:r>
-        <w:t xml:space="preserve"> </w:t>
-      </w:r>
-      <w:r>
-        <w:t xml:space="preserve">DOI is pending; repository URL is available now.</w:t>
-      </w:r>
-      <w:r>
-        <w:t xml:space="preserve"> </w:t>
-      </w:r>
-      <w:r>
-        <w:t xml:space="preserve">Author details, conflict-of-interest disclosures, funding, ethics/exemption wording and repository metadata details should be completed by the submitting authors before portal upload.</w:t>
+        <w:t>Public repository URL: https://github.com/xutaoguo55/ici-irae-phenotype-decomposition-esmo-open-v3-10 Submission package URL (v3.10 release): https://github.com/xutaoguo55/ici-irae-phenotype-decomposition-esmo-open-v3-10/releases/tag/v3.10 Repository DOI: 10.5281/zenodo.20989857 (https://doi.org/10.5281/zenodo.20989857). (https://doi.org/10.5281/zenodo.20989857). (https://doi.org/10.5281/zenodo.20989857). (https://doi.org/10.5281/zenodo.20989857). (https://doi.org/10.5281/zenodo.20989857). Author details, conflict-of-interest disclosures, funding, ethics/exemption wording and repository metadata details should be completed by the submitting authors before portal upload.</w:t>
       </w:r>
     </w:p>
     <w:bookmarkEnd w:id="9"/>
     <w:sectPr>
+      <w:headerReference w:type="default" r:id="rId9"/>
+      <w:footerReference w:type="default" r:id="rId10"/>
       <w:footnotePr>
         <w:numRestart w:val="eachSect"/>
       </w:footnotePr>
@@ -151,6 +241,16 @@
 <w:comments xmlns:w="http://schemas.openxmlformats.org/wordprocessingml/2006/main" xmlns:m="http://schemas.openxmlformats.org/officeDocument/2006/math" xmlns:r="http://schemas.openxmlformats.org/officeDocument/2006/relationships" xmlns:o="urn:schemas-microsoft-com:office:office" xmlns:v="urn:schemas-microsoft-com:vml" xmlns:w10="urn:schemas-microsoft-com:office:word" xmlns:a="http://schemas.openxmlformats.org/drawingml/2006/main" xmlns:pic="http://schemas.openxmlformats.org/drawingml/2006/picture" xmlns:wp="http://schemas.openxmlformats.org/drawingml/2006/wordprocessingDrawing"/>
 </file>
 
+<file path=word/footer1.xml><?xml version="1.0" encoding="utf-8"?>
+<w:ftr xmlns:m="http://schemas.openxmlformats.org/officeDocument/2006/math" xmlns:mc="http://schemas.openxmlformats.org/markup-compatibility/2006" xmlns:mo="http://schemas.microsoft.com/office/mac/office/2008/main" xmlns:mv="urn:schemas-microsoft-com:mac:vml" xmlns:o="urn:schemas-microsoft-com:office:office" xmlns:r="http://schemas.openxmlformats.org/officeDocument/2006/relationships" xmlns:v="urn:schemas-microsoft-com:vml" xmlns:w10="urn:schemas-microsoft-com:office:word" xmlns:w14="http://schemas.microsoft.com/office/word/2010/wordml" xmlns:w="http://schemas.openxmlformats.org/wordprocessingml/2006/main" xmlns:wne="http://schemas.microsoft.com/office/word/2006/wordml" xmlns:wp14="http://schemas.microsoft.com/office/word/2010/wordprocessingDrawing" xmlns:wp="http://schemas.openxmlformats.org/drawingml/2006/wordprocessingDrawing" xmlns:wpc="http://schemas.microsoft.com/office/word/2010/wordprocessingCanvas" xmlns:wpg="http://schemas.microsoft.com/office/word/2010/wordprocessingGroup" xmlns:wpi="http://schemas.microsoft.com/office/word/2010/wordprocessingInk" xmlns:wps="http://schemas.microsoft.com/office/word/2010/wordprocessingShape" mc:Ignorable="w14 wp14">
+  <w:p>
+    <w:pPr>
+      <w:pStyle w:val="Footer"/>
+    </w:pPr>
+  </w:p>
+</w:ftr>
+</file>
+
 <file path=word/footnotes.xml><?xml version="1.0" encoding="utf-8"?>
 <w:footnotes xmlns:w="http://schemas.openxmlformats.org/wordprocessingml/2006/main" xmlns:m="http://schemas.openxmlformats.org/officeDocument/2006/math" xmlns:r="http://schemas.openxmlformats.org/officeDocument/2006/relationships" xmlns:o="urn:schemas-microsoft-com:office:office" xmlns:v="urn:schemas-microsoft-com:vml" xmlns:w10="urn:schemas-microsoft-com:office:word" xmlns:a="http://schemas.openxmlformats.org/drawingml/2006/main" xmlns:pic="http://schemas.openxmlformats.org/drawingml/2006/picture" xmlns:wp="http://schemas.openxmlformats.org/drawingml/2006/wordprocessingDrawing">
   <w:footnote w:type="continuationSeparator" w:id="0">
@@ -168,6 +268,16 @@
     </w:p>
   </w:footnote>
 </w:footnotes>
+</file>
+
+<file path=word/header1.xml><?xml version="1.0" encoding="utf-8"?>
+<w:hdr xmlns:m="http://schemas.openxmlformats.org/officeDocument/2006/math" xmlns:mc="http://schemas.openxmlformats.org/markup-compatibility/2006" xmlns:mo="http://schemas.microsoft.com/office/mac/office/2008/main" xmlns:mv="urn:schemas-microsoft-com:mac:vml" xmlns:o="urn:schemas-microsoft-com:office:office" xmlns:r="http://schemas.openxmlformats.org/officeDocument/2006/relationships" xmlns:v="urn:schemas-microsoft-com:vml" xmlns:w10="urn:schemas-microsoft-com:office:word" xmlns:w14="http://schemas.microsoft.com/office/word/2010/wordml" xmlns:w="http://schemas.openxmlformats.org/wordprocessingml/2006/main" xmlns:wne="http://schemas.microsoft.com/office/word/2006/wordml" xmlns:wp14="http://schemas.microsoft.com/office/word/2010/wordprocessingDrawing" xmlns:wp="http://schemas.openxmlformats.org/drawingml/2006/wordprocessingDrawing" xmlns:wpc="http://schemas.microsoft.com/office/word/2010/wordprocessingCanvas" xmlns:wpg="http://schemas.microsoft.com/office/word/2010/wordprocessingGroup" xmlns:wpi="http://schemas.microsoft.com/office/word/2010/wordprocessingInk" xmlns:wps="http://schemas.microsoft.com/office/word/2010/wordprocessingShape" mc:Ignorable="w14 wp14">
+  <w:p>
+    <w:pPr>
+      <w:pStyle w:val="Header"/>
+    </w:pPr>
+  </w:p>
+</w:hdr>
 </file>
 
 <file path=word/numbering.xml><?xml version="1.0" encoding="utf-8"?>

</xml_diff>

<commit_message>
v3.10 final: 5-dimension comprehensive upgrade
1. Title: 'Can ICI Toxicity Be Compared Across Tumor Types?
   Four Evidence Systems Say No.'
2. Clinical scenario opening: MDT tumor board vignette
   (KEYNOTE-006 vs KEYNOTE-087 endpoint mismatch)
3. Box 1: Toxicity Phenotype Interpretation Standard
   (table: what each system CAN/CANNOT answer)
4. Named critique of cross-tumor meta-analyses
   ('differs by tumor type' without endpoint specification)
5. Direct clinical language throughout
   ('Cannot: compare organ irAE across tumors')
6. Graphical Abstract redesigned: each panel shows
   what the system measures AND what it CANNOT answer
7. Cover letter: reframed as 'prior question the field overlooked'
8. Discussion reorganized: What this study IS → Why it matters →
   What the framework means → What is required

All data, figures unchanged. Manuscript now reads as a
pre-emptive evidence audit, not a conventional meta-analysis.

Co-Authored-By: Claude <noreply@anthropic.com>
</commit_message>
<xml_diff>
--- a/UPLOAD_THIS_ESMO_OPEN_V3_10_HARDENED_UNDER20/ESMO_OPEN_COVER_LETTER_RATIONALE_V3_10.docx
+++ b/UPLOAD_THIS_ESMO_OPEN_V3_10_HARDENED_UNDER20/ESMO_OPEN_COVER_LETTER_RATIONALE_V3_10.docx
@@ -7,7 +7,7 @@
         <w:pStyle w:val="Heading1"/>
       </w:pPr>
       <w:r>
-        <w:t>ESMO Open Cover Letter Rationale v3.10</w:t>
+        <w:t>ESMO Open Cover Letter</w:t>
       </w:r>
     </w:p>
     <w:p>
@@ -17,7 +17,6 @@
     </w:p>
     <w:p/>
     <w:p>
-      <w:pPr/>
       <w:r>
         <w:t>Authors:</w:t>
       </w:r>
@@ -27,82 +26,50 @@
         <w:t>Junwei Huang†¹, Xiaolei Wei†¹, Haiqing Zheng†², Qi Wei¹, Yongqiang Wei¹, Ru Feng¹, Xutao Guo*¹,³</w:t>
       </w:r>
     </w:p>
-    <w:p/>
     <w:p>
       <w:r>
-        <w:t>¹ Department of Hematology, Nanfang Hospital, Southern Medical University, Guangzhou, China</w:t>
+        <w:t>¹ Nanfang Hospital, Southern Medical University, Guangzhou, China</w:t>
       </w:r>
     </w:p>
     <w:p>
       <w:r>
-        <w:t>² Department of Nosocomial Infection Management, Nanfang Hospital, Southern Medical University, Guangzhou, China</w:t>
+        <w:t>² Department of Nosocomial Infection Management, Nanfang Hospital, Southern Medical University</w:t>
       </w:r>
     </w:p>
     <w:p>
       <w:r>
-        <w:t>³ Clinical Medical Research Center of Hematological Diseases of Guangdong Province, Guangzhou, China</w:t>
+        <w:t>³ Clinical Medical Research Center of Hematological Diseases of Guangdong Province</w:t>
+      </w:r>
+    </w:p>
+    <w:p>
+      <w:r>
+        <w:t>† Equal contribution. * Correspondence: guoxutao@smu.edu.cn</w:t>
       </w:r>
     </w:p>
     <w:p/>
     <w:p>
       <w:r>
-        <w:t>† These authors contributed equally to this work.</w:t>
+        <w:t>We submit a secondary translational evidence analysis that asks a prior question the field has overlooked: "Can ICI toxicity be compared across tumor types with the evidence we have?" The answer—shown across four non-exchangeable evidence systems—is no.</w:t>
       </w:r>
     </w:p>
     <w:p>
       <w:r>
-        <w:t>* Correspondence: Xutao Guo, guoxutao@smu.edu.cn</w:t>
-      </w:r>
-    </w:p>
-    <w:p/>
-    <w:p>
-      <w:r>
-        <w:t>We submit for consideration a secondary translational evidence analysis entitled "Immune Checkpoint Inhibitor Toxicity Comparisons Across Tumor Types Require Endpoint-Defined Evidence Decomposition."</w:t>
+        <w:t>Using lymphoma versus solid tumors as a clinical stress test, we audited the four evidence types most commonly invoked in cross-tumor comparisons: aggregate trial safety tables (384 rows, 36 source blocks), organ-specific strict irAE estimability (23 strata, 18 not estimable), openFDA pharmacovigilance signals (80 agent-family ROR cells), and patient-level melanoma PBMC molecular support (60 samples, 4 unadjusted FDR hits → 0 after therapy adjustment). None of these systems can support reliable cross-tumor ICI toxicity inference with currently available public data.</w:t>
       </w:r>
     </w:p>
     <w:p>
       <w:r>
-        <w:t>The manuscript addresses a practical oncology safety problem with broad implications: ICI toxicity is increasingly compared across tumor types to guide treatment selection, patient counseling and trial design, yet these comparisons rarely specify which toxicity endpoint is being measured. Using lymphoma versus solid tumors as a clinical stress test, we show that broad high-grade treatment-related safety burden, strict organ-specific inflammatory irAE, pharmacovigilance reporting signals and patient-level molecular support do not answer the same question—and that this problem generalizes to any cross-tumor ICI toxicity comparison.</w:t>
+        <w:t>The manuscript provides a phenotype interpretation standard—a practical guide defining what each evidence system can and cannot answer in cross-tumor contexts. It is not framed as a definitive meta-analysis, does not claim lineage causality, and does not interpret openFDA RORs as clinical incidence. Its contribution is to make the problem of endpoint heterogeneity visible, measurable, and actionable.</w:t>
       </w:r>
     </w:p>
     <w:p>
       <w:r>
-        <w:t>The analysis combines four bounded evidence systems:</w:t>
+        <w:t>We believe this fits ESMO Open as an oncology-wide translational evidence analysis with direct implications for how the field interprets, reports, and designs cross-tumor ICI safety comparisons.</w:t>
       </w:r>
     </w:p>
     <w:p>
       <w:r>
-        <w:t>1. a locked aggregate source registry of 384 endpoint-labelled rows across 36 source blocks;</w:t>
-      </w:r>
-    </w:p>
-    <w:p>
-      <w:r>
-        <w:t>2. an organ-specific strict irAE estimability audit showing that 18 of 23 organ-by-grade strata were unsuitable for lineage-wide pooling;</w:t>
-      </w:r>
-    </w:p>
-    <w:p>
-      <w:r>
-        <w:t>3. an exact-match openFDA drug/event reporting-signal analysis across 10 ICI agents and 8 irAE reporting families, interpreted only as a pharmacovigilance reporting-signal phenotype;</w:t>
-      </w:r>
-    </w:p>
-    <w:p>
-      <w:r>
-        <w:t>4. an external melanoma PBMC molecular-support analysis showing unadjusted severe-irAE immune-signature associations that did not remain FDR-significant after exploratory therapy adjustment.</w:t>
-      </w:r>
-    </w:p>
-    <w:p>
-      <w:r>
-        <w:t>The manuscript is deliberately not framed as a definitive lymphoma-versus-solid tumor irAE meta-analysis. It does not claim intrinsic lineage causality, clinical steroid mediation, chemotherapy-timing causality, openFDA incidence or biomarker validation. Its contribution is a generalizable phenotype-decomposition framework for interpreting and designing cross-tumor ICI toxicity studies: different evidence systems measure different toxicity phenotypes, and cross-tumor comparisons are only interpretable when the phenotype is specified.</w:t>
-      </w:r>
-    </w:p>
-    <w:p>
-      <w:r>
-        <w:t>We believe this article fits ESMO Open as an oncology-wide translational evidence analysis focused on immunotherapy safety interpretation and future study design. It is intended to reduce clinically misleading cross-tumor toxicity comparisons by defining which toxicity phenotypes are estimable from public aggregate evidence and which require harmonized patient-level irAE and biomarker data.</w:t>
-      </w:r>
-    </w:p>
-    <w:p>
-      <w:r>
-        <w:t>Public repository URL: https://github.com/xutaoguo55/ici-irae-phenotype-decomposition-esmo-open-v3-10 Submission package URL (v3.10 release): https://github.com/xutaoguo55/ici-irae-phenotype-decomposition-esmo-open-v3-10/releases/tag/v3.10 Repository DOI: 10.5281/zenodo.20989857 (https://doi.org/10.5281/zenodo.20989857).</w:t>
+        <w:t>Repository: https://github.com/xutaoguo55/ici-irae-phenotype-decomposition-esmo-open-v3-10 Release v3.10: https://github.com/xutaoguo55/ici-irae-phenotype-decomposition-esmo-open-v3-10/releases/tag/v3.10 DOI: 10.5281/zenodo.20989857</w:t>
       </w:r>
     </w:p>
     <w:sectPr>

</xml_diff>

<commit_message>
v3.10 polish: fold Clinical Scenario into Introduction, trim passive voice, compact prose
- Clinical Scenario now opens Introduction (not a separate H2 section)
- Methods shortened ~30%: endpoint taxonomy, clinical synthesis, organ audit
- Results tightened: TRAE section, organ section, PBMC section
- Discussion reorganized: What this is → Why it matters → Framework → Requirements → Limitations → Conclusion
- Box 1 table refined with clearer allowed/forbidden inference columns
- Figure legends shortened to 1-2 lines each
- Cover letter condensed to 3 paragraphs
- Abstract: 272 words (within 300-word limit)
- Self-references reduced; passive voice reduced throughout

Co-Authored-By: Claude <noreply@anthropic.com>
</commit_message>
<xml_diff>
--- a/UPLOAD_THIS_ESMO_OPEN_V3_10_HARDENED_UNDER20/ESMO_OPEN_COVER_LETTER_RATIONALE_V3_10.docx
+++ b/UPLOAD_THIS_ESMO_OPEN_V3_10_HARDENED_UNDER20/ESMO_OPEN_COVER_LETTER_RATIONALE_V3_10.docx
@@ -18,58 +18,38 @@
     <w:p/>
     <w:p>
       <w:r>
-        <w:t>Authors:</w:t>
+        <w:t>Authors: Junwei Huang†¹, Xiaolei Wei†¹, Haiqing Zheng†², Qi Wei¹, Yongqiang Wei¹, Ru Feng¹, Xutao Guo*¹,³</w:t>
       </w:r>
     </w:p>
     <w:p>
       <w:r>
-        <w:t>Junwei Huang†¹, Xiaolei Wei†¹, Haiqing Zheng†², Qi Wei¹, Yongqiang Wei¹, Ru Feng¹, Xutao Guo*¹,³</w:t>
+        <w:t>¹²³ Nanfang Hospital, Southern Medical University, Guangzhou, China</w:t>
       </w:r>
     </w:p>
     <w:p>
       <w:r>
-        <w:t>¹ Nanfang Hospital, Southern Medical University, Guangzhou, China</w:t>
-      </w:r>
-    </w:p>
-    <w:p>
-      <w:r>
-        <w:t>² Department of Nosocomial Infection Management, Nanfang Hospital, Southern Medical University</w:t>
-      </w:r>
-    </w:p>
-    <w:p>
-      <w:r>
-        <w:t>³ Clinical Medical Research Center of Hematological Diseases of Guangdong Province</w:t>
-      </w:r>
-    </w:p>
-    <w:p>
-      <w:r>
-        <w:t>† Equal contribution. * Correspondence: guoxutao@smu.edu.cn</w:t>
+        <w:t>† Equal contribution. * guoxutao@smu.edu.cn</w:t>
       </w:r>
     </w:p>
     <w:p/>
     <w:p>
       <w:r>
-        <w:t>We submit a secondary translational evidence analysis that asks a prior question the field has overlooked: "Are cross-tumor ICI toxicity comparisons supported by current evidence?" A four-system phenotype decomposition analysis shows they are not—because the four evidence types most commonly invoked in such comparisons measure fundamentally different toxicity phenotypes.</w:t>
+        <w:t>We submit a secondary translational evidence analysis entitled "Cross-Tumor Immune Checkpoint Inhibitor Toxicity Comparisons Are Not Supported by Current Evidence: A Four-System Phenotype Decomposition Analysis."</w:t>
       </w:r>
     </w:p>
     <w:p>
       <w:r>
-        <w:t>Using lymphoma versus solid tumors as a clinical stress test, we audited the four evidence types most commonly invoked in cross-tumor comparisons: aggregate trial safety tables (384 rows, 36 source blocks), organ-specific strict irAE estimability (23 strata, 18 not estimable), openFDA pharmacovigilance signals (80 agent-family ROR cells), and patient-level melanoma PBMC molecular support (60 samples, 4 unadjusted FDR hits → 0 after therapy adjustment). None of these systems can support reliable cross-tumor ICI toxicity inference with currently available public data.</w:t>
+        <w:t>The manuscript addresses a prior question the field has overlooked: can cross-tumor ICI toxicity comparisons actually be made with the evidence we have? Using lymphoma versus solid tumors as a clinical stress test, we audit four evidence systems commonly invoked in such comparisons—aggregate trial safety tables (384 rows, 36 source blocks), strict organ-specific irAE estimability (23 strata, 18 not estimable), openFDA pharmacovigilance signals (10 agents, 8 families), and patient-level PBMC molecular support (60 samples, 4 unadjusted FDR hits → 0 after therapy adjustment). None of these systems supports reliable cross-tumor inference with currently available public data.</w:t>
       </w:r>
     </w:p>
     <w:p>
       <w:r>
-        <w:t>The manuscript provides a phenotype interpretation standard—a practical guide defining what each evidence system can and cannot answer in cross-tumor contexts. It is not framed as a definitive meta-analysis, does not claim lineage causality, and does not interpret openFDA RORs as clinical incidence. Its contribution is to make the problem of endpoint heterogeneity visible, measurable, and actionable.</w:t>
+        <w:t>The manuscript provides a phenotype interpretation standard (Box 1) defining what each evidence system can and cannot answer in cross-tumor contexts. It is not framed as a definitive meta-analysis, does not claim lineage causality, and does not interpret openFDA RORs as clinical incidence. Its contribution is to make the problem of endpoint heterogeneity visible, measurable, and actionable—with direct implications for how the field interprets, reports, and designs cross-tumor ICI safety comparisons.</w:t>
       </w:r>
     </w:p>
     <w:p>
       <w:r>
-        <w:t>We believe this fits ESMO Open as an oncology-wide translational evidence analysis with direct implications for how the field interprets, reports, and designs cross-tumor ICI safety comparisons.</w:t>
-      </w:r>
-    </w:p>
-    <w:p>
-      <w:r>
-        <w:t>Repository: https://github.com/xutaoguo55/ici-irae-phenotype-decomposition-esmo-open-v3-10 Release v3.10: https://github.com/xutaoguo55/ici-irae-phenotype-decomposition-esmo-open-v3-10/releases/tag/v3.10 DOI: 10.5281/zenodo.20989857</w:t>
+        <w:t>Repository: https://github.com/xutaoguo55/ici-irae-phenotype-decomposition-esmo-open-v3-10 · Release v3.10 · DOI: 10.5281/zenodo.20989857</w:t>
       </w:r>
     </w:p>
     <w:sectPr>
@@ -445,6 +425,10 @@
     <w:name w:val="Normal"/>
     <w:qFormat/>
     <w:rsid w:val="00FC693F"/>
+    <w:rPr>
+      <w:rFonts w:ascii="Times New Roman" w:hAnsi="Times New Roman"/>
+      <w:sz w:val="22"/>
+    </w:rPr>
   </w:style>
   <w:style w:type="paragraph" w:styleId="Header">
     <w:name w:val="header"/>

</xml_diff>